<commit_message>
feat(storage): add BlobStorage:Enabled flag (true = blob, false = database)
Add an explicit master on/off switch for blob storage. When false, files
are always stored in the database Content column even if a connection
string is present; when true (default), blob is used when a connection
string is configured — so existing deployments are unchanged.

- BlobStorageOptions.Enabled (default true).
- AzureBlobStorageService short-circuits to disabled when Enabled=false,
  logging "Blob storage disabled by configuration". Container stays null,
  so SupplierDocumentService/CustomerDocumentService route uploads to the
  DB Content column via their existing fileStore.Enabled branch.
- Document the key in the Configuration Document (File Storage section).

Read at startup (restart to apply). Does not migrate existing files.

Co-Authored-By: Claude Opus 4.8 <noreply@anthropic.com>
Claude-Session: https://claude.ai/code/session_01Bv28UYjCv2nEkbFMC2MiqD
</commit_message>
<xml_diff>
--- a/docs/word/Supplier Portal - Configuration Document.docx
+++ b/docs/word/Supplier Portal - Configuration Document.docx
@@ -3351,6 +3351,91 @@
                 <w:sz w:val="18"/>
                 <w:szCs w:val="18"/>
               </w:rPr>
+              <w:t xml:space="preserve">BlobStorage:Enabled</w:t>
+            </w:r>
+          </w:p>
+        </w:tc>
+        <w:tc>
+          <w:tcPr>
+            <w:tcW w:type="dxa" w:w="1500"/>
+            <w:shd w:fill="F1F4F9" w:color="auto" w:val="clear"/>
+            <w:tcMar>
+              <w:top w:type="dxa" w:w="40"/>
+              <w:left w:type="dxa" w:w="70"/>
+              <w:bottom w:type="dxa" w:w="40"/>
+              <w:right w:type="dxa" w:w="70"/>
+            </w:tcMar>
+          </w:tcPr>
+          <w:p>
+            <w:pPr>
+              <w:spacing w:after="0" w:line="240"/>
+            </w:pPr>
+            <w:r>
+              <w:rPr>
+                <w:rFonts w:ascii="Calibri" w:cs="Calibri" w:eastAsia="Calibri" w:hAnsi="Calibri"/>
+                <w:b w:val="false"/>
+                <w:bCs w:val="false"/>
+                <w:color w:val="22303F"/>
+                <w:sz w:val="18"/>
+                <w:szCs w:val="18"/>
+              </w:rPr>
+              <w:t xml:space="preserve">true</w:t>
+            </w:r>
+          </w:p>
+        </w:tc>
+        <w:tc>
+          <w:tcPr>
+            <w:tcW w:type="dxa" w:w="4700"/>
+            <w:shd w:fill="F1F4F9" w:color="auto" w:val="clear"/>
+            <w:tcMar>
+              <w:top w:type="dxa" w:w="40"/>
+              <w:left w:type="dxa" w:w="70"/>
+              <w:bottom w:type="dxa" w:w="40"/>
+              <w:right w:type="dxa" w:w="70"/>
+            </w:tcMar>
+          </w:tcPr>
+          <w:p>
+            <w:pPr>
+              <w:spacing w:after="0" w:line="240"/>
+            </w:pPr>
+            <w:r>
+              <w:rPr>
+                <w:rFonts w:ascii="Calibri" w:cs="Calibri" w:eastAsia="Calibri" w:hAnsi="Calibri"/>
+                <w:b w:val="false"/>
+                <w:bCs w:val="false"/>
+                <w:color w:val="22303F"/>
+                <w:sz w:val="18"/>
+                <w:szCs w:val="18"/>
+              </w:rPr>
+              <w:t xml:space="preserve">Master on/off switch. false = always store files in the database even if a ConnectionString is set; true (default) = use blob when a ConnectionString is configured. Read at startup (restart to apply).</w:t>
+            </w:r>
+          </w:p>
+        </w:tc>
+      </w:tr>
+      <w:tr>
+        <w:tc>
+          <w:tcPr>
+            <w:tcW w:type="dxa" w:w="3300"/>
+            <w:tcMar>
+              <w:top w:type="dxa" w:w="40"/>
+              <w:left w:type="dxa" w:w="70"/>
+              <w:bottom w:type="dxa" w:w="40"/>
+              <w:right w:type="dxa" w:w="70"/>
+            </w:tcMar>
+          </w:tcPr>
+          <w:p>
+            <w:pPr>
+              <w:spacing w:after="0" w:line="240"/>
+            </w:pPr>
+            <w:r>
+              <w:rPr>
+                <w:rFonts w:ascii="Calibri" w:cs="Calibri" w:eastAsia="Calibri" w:hAnsi="Calibri"/>
+                <w:b w:val="false"/>
+                <w:bCs w:val="false"/>
+                <w:color w:val="22303F"/>
+                <w:sz w:val="18"/>
+                <w:szCs w:val="18"/>
+              </w:rPr>
               <w:t xml:space="preserve">BlobStorage:ConnectionString</w:t>
             </w:r>
           </w:p>
@@ -3358,7 +3443,6 @@
         <w:tc>
           <w:tcPr>
             <w:tcW w:type="dxa" w:w="1500"/>
-            <w:shd w:fill="F1F4F9" w:color="auto" w:val="clear"/>
             <w:tcMar>
               <w:top w:type="dxa" w:w="40"/>
               <w:left w:type="dxa" w:w="70"/>
@@ -3386,7 +3470,6 @@
         <w:tc>
           <w:tcPr>
             <w:tcW w:type="dxa" w:w="4700"/>
-            <w:shd w:fill="F1F4F9" w:color="auto" w:val="clear"/>
             <w:tcMar>
               <w:top w:type="dxa" w:w="40"/>
               <w:left w:type="dxa" w:w="70"/>
@@ -3416,6 +3499,7 @@
         <w:tc>
           <w:tcPr>
             <w:tcW w:type="dxa" w:w="3300"/>
+            <w:shd w:fill="F1F4F9" w:color="auto" w:val="clear"/>
             <w:tcMar>
               <w:top w:type="dxa" w:w="40"/>
               <w:left w:type="dxa" w:w="70"/>
@@ -3443,6 +3527,7 @@
         <w:tc>
           <w:tcPr>
             <w:tcW w:type="dxa" w:w="1500"/>
+            <w:shd w:fill="F1F4F9" w:color="auto" w:val="clear"/>
             <w:tcMar>
               <w:top w:type="dxa" w:w="40"/>
               <w:left w:type="dxa" w:w="70"/>
@@ -3470,6 +3555,7 @@
         <w:tc>
           <w:tcPr>
             <w:tcW w:type="dxa" w:w="4700"/>
+            <w:shd w:fill="F1F4F9" w:color="auto" w:val="clear"/>
             <w:tcMar>
               <w:top w:type="dxa" w:w="40"/>
               <w:left w:type="dxa" w:w="70"/>

</xml_diff>

<commit_message>
Docs: refresh Configuration Document and Azure Deployment Guide
- Configuration Document: add Auth:AllowSelfRegistration (default false); replace
  the old SHA-256 break-glass key with the current admin-set salted PBKDF2 store
  (SecretStorePath/Iterations/MinSecretLength); new Scheduled Reports section
  (Reports:SchedulerEnabled/PollSeconds/TimeZone) with the Graph/SMTP attachment
  note.
- Azure Deployment Guide: app-setting rows for AllowSelfRegistration,
  Reports scheduler, and BreakGlass:Enabled; note the new tables apply via EF
  MigrateAsync on startup; break-glass + scheduled-report operations notes.

Co-Authored-By: Claude Opus 4.8 <noreply@anthropic.com>
Claude-Session: https://claude.ai/code/session_01Bv28UYjCv2nEkbFMC2MiqD
</commit_message>
<xml_diff>
--- a/docs/word/Supplier Portal - Configuration Document.docx
+++ b/docs/word/Supplier Portal - Configuration Document.docx
@@ -356,7 +356,7 @@
                 <w:sz w:val="18"/>
                 <w:szCs w:val="18"/>
               </w:rPr>
-              <w:t xml:space="preserve">16 September 2026</w:t>
+              <w:t xml:space="preserve">17 September 2026</w:t>
             </w:r>
           </w:p>
         </w:tc>
@@ -1572,6 +1572,90 @@
                 <w:sz w:val="18"/>
                 <w:szCs w:val="18"/>
               </w:rPr>
+              <w:t xml:space="preserve">Auth:AllowSelfRegistration</w:t>
+            </w:r>
+          </w:p>
+        </w:tc>
+        <w:tc>
+          <w:tcPr>
+            <w:tcW w:type="dxa" w:w="1500"/>
+            <w:tcMar>
+              <w:top w:type="dxa" w:w="40"/>
+              <w:left w:type="dxa" w:w="70"/>
+              <w:bottom w:type="dxa" w:w="40"/>
+              <w:right w:type="dxa" w:w="70"/>
+            </w:tcMar>
+          </w:tcPr>
+          <w:p>
+            <w:pPr>
+              <w:spacing w:after="0" w:line="240"/>
+            </w:pPr>
+            <w:r>
+              <w:rPr>
+                <w:rFonts w:ascii="Calibri" w:cs="Calibri" w:eastAsia="Calibri" w:hAnsi="Calibri"/>
+                <w:b w:val="false"/>
+                <w:bCs w:val="false"/>
+                <w:color w:val="22303F"/>
+                <w:sz w:val="18"/>
+                <w:szCs w:val="18"/>
+              </w:rPr>
+              <w:t xml:space="preserve">false</w:t>
+            </w:r>
+          </w:p>
+        </w:tc>
+        <w:tc>
+          <w:tcPr>
+            <w:tcW w:type="dxa" w:w="4700"/>
+            <w:tcMar>
+              <w:top w:type="dxa" w:w="40"/>
+              <w:left w:type="dxa" w:w="70"/>
+              <w:bottom w:type="dxa" w:w="40"/>
+              <w:right w:type="dxa" w:w="70"/>
+            </w:tcMar>
+          </w:tcPr>
+          <w:p>
+            <w:pPr>
+              <w:spacing w:after="0" w:line="240"/>
+            </w:pPr>
+            <w:r>
+              <w:rPr>
+                <w:rFonts w:ascii="Calibri" w:cs="Calibri" w:eastAsia="Calibri" w:hAnsi="Calibri"/>
+                <w:b w:val="false"/>
+                <w:bCs w:val="false"/>
+                <w:color w:val="22303F"/>
+                <w:sz w:val="18"/>
+                <w:szCs w:val="18"/>
+              </w:rPr>
+              <w:t xml:space="preserve">When false (the default) the public /account/register page is disabled and accounts are created by administrators. Closes the vector that let scanners create junk registrations.</w:t>
+            </w:r>
+          </w:p>
+        </w:tc>
+      </w:tr>
+      <w:tr>
+        <w:tc>
+          <w:tcPr>
+            <w:tcW w:type="dxa" w:w="3300"/>
+            <w:shd w:fill="F1F4F9" w:color="auto" w:val="clear"/>
+            <w:tcMar>
+              <w:top w:type="dxa" w:w="40"/>
+              <w:left w:type="dxa" w:w="70"/>
+              <w:bottom w:type="dxa" w:w="40"/>
+              <w:right w:type="dxa" w:w="70"/>
+            </w:tcMar>
+          </w:tcPr>
+          <w:p>
+            <w:pPr>
+              <w:spacing w:after="0" w:line="240"/>
+            </w:pPr>
+            <w:r>
+              <w:rPr>
+                <w:rFonts w:ascii="Calibri" w:cs="Calibri" w:eastAsia="Calibri" w:hAnsi="Calibri"/>
+                <w:b w:val="false"/>
+                <w:bCs w:val="false"/>
+                <w:color w:val="22303F"/>
+                <w:sz w:val="18"/>
+                <w:szCs w:val="18"/>
+              </w:rPr>
               <w:t xml:space="preserve">Auth:DevBypassEnabled</w:t>
             </w:r>
           </w:p>
@@ -1579,6 +1663,7 @@
         <w:tc>
           <w:tcPr>
             <w:tcW w:type="dxa" w:w="1500"/>
+            <w:shd w:fill="F1F4F9" w:color="auto" w:val="clear"/>
             <w:tcMar>
               <w:top w:type="dxa" w:w="40"/>
               <w:left w:type="dxa" w:w="70"/>
@@ -1606,6 +1691,7 @@
         <w:tc>
           <w:tcPr>
             <w:tcW w:type="dxa" w:w="4700"/>
+            <w:shd w:fill="F1F4F9" w:color="auto" w:val="clear"/>
             <w:tcMar>
               <w:top w:type="dxa" w:w="40"/>
               <w:left w:type="dxa" w:w="70"/>
@@ -2194,7 +2280,20 @@
           <w:sz w:val="25"/>
           <w:szCs w:val="25"/>
         </w:rPr>
-        <w:t xml:space="preserve">3.2 Break-glass</w:t>
+        <w:t xml:space="preserve">3.2 Break-glass (emergency access)</w:t>
+      </w:r>
+    </w:p>
+    <w:p>
+      <w:pPr>
+        <w:spacing w:after="120" w:line="276"/>
+      </w:pPr>
+      <w:r>
+        <w:rPr>
+          <w:rFonts w:ascii="Calibri" w:cs="Calibri" w:eastAsia="Calibri" w:hAnsi="Calibri"/>
+          <w:sz w:val="18"/>
+          <w:szCs w:val="18"/>
+        </w:rPr>
+        <w:t xml:space="preserve">Break-glass works only when BreakGlass:Enabled=true AND a secret has been configured. The emergency secret is set/rotated by an administrator inside the app (Settings &gt; Break-Glass Access) and is stored only as a salted PBKDF2-SHA256 hash (~210,000 iterations) in a protected file — never in plaintext and never in the database.</w:t>
       </w:r>
     </w:p>
     <w:tbl>
@@ -2384,36 +2483,36 @@
                 <w:sz w:val="18"/>
                 <w:szCs w:val="18"/>
               </w:rPr>
-              <w:t xml:space="preserve">Emergency Administrator access. Disabled unless a SHA-256 secret hash is configured.</w:t>
-            </w:r>
-          </w:p>
-        </w:tc>
-      </w:tr>
-      <w:tr>
-        <w:tc>
-          <w:tcPr>
-            <w:tcW w:type="dxa" w:w="3300"/>
-            <w:tcMar>
-              <w:top w:type="dxa" w:w="40"/>
-              <w:left w:type="dxa" w:w="70"/>
-              <w:bottom w:type="dxa" w:w="40"/>
-              <w:right w:type="dxa" w:w="70"/>
-            </w:tcMar>
-          </w:tcPr>
-          <w:p>
-            <w:pPr>
-              <w:spacing w:after="0" w:line="240"/>
-            </w:pPr>
-            <w:r>
-              <w:rPr>
-                <w:rFonts w:ascii="Calibri" w:cs="Calibri" w:eastAsia="Calibri" w:hAnsi="Calibri"/>
-                <w:b w:val="false"/>
-                <w:bCs w:val="false"/>
-                <w:color w:val="22303F"/>
-                <w:sz w:val="18"/>
-                <w:szCs w:val="18"/>
-              </w:rPr>
-              <w:t xml:space="preserve">BreakGlass:SecretHash</w:t>
+              <w:t xml:space="preserve">Deployment master switch for emergency Administrator access. Even when true, break-glass stays inactive until a secret has been configured in-app.</w:t>
+            </w:r>
+          </w:p>
+        </w:tc>
+      </w:tr>
+      <w:tr>
+        <w:tc>
+          <w:tcPr>
+            <w:tcW w:type="dxa" w:w="3300"/>
+            <w:tcMar>
+              <w:top w:type="dxa" w:w="40"/>
+              <w:left w:type="dxa" w:w="70"/>
+              <w:bottom w:type="dxa" w:w="40"/>
+              <w:right w:type="dxa" w:w="70"/>
+            </w:tcMar>
+          </w:tcPr>
+          <w:p>
+            <w:pPr>
+              <w:spacing w:after="0" w:line="240"/>
+            </w:pPr>
+            <w:r>
+              <w:rPr>
+                <w:rFonts w:ascii="Calibri" w:cs="Calibri" w:eastAsia="Calibri" w:hAnsi="Calibri"/>
+                <w:b w:val="false"/>
+                <w:bCs w:val="false"/>
+                <w:color w:val="22303F"/>
+                <w:sz w:val="18"/>
+                <w:szCs w:val="18"/>
+              </w:rPr>
+              <w:t xml:space="preserve">BreakGlass:SecretStorePath</w:t>
             </w:r>
           </w:p>
         </w:tc>
@@ -2440,7 +2539,7 @@
                 <w:sz w:val="18"/>
                 <w:szCs w:val="18"/>
               </w:rPr>
-              <w:t xml:space="preserve">(secret)</w:t>
+              <w:t xml:space="preserve">App_Data/break-glass-secret.json</w:t>
             </w:r>
           </w:p>
         </w:tc>
@@ -2467,16 +2566,270 @@
                 <w:sz w:val="18"/>
                 <w:szCs w:val="18"/>
               </w:rPr>
-              <w:t xml:space="preserve">SHA-256 hash of the emergency secret (constant-time compared).</w:t>
-            </w:r>
-          </w:p>
-        </w:tc>
-      </w:tr>
-      <w:tr>
-        <w:tc>
-          <w:tcPr>
-            <w:tcW w:type="dxa" w:w="3300"/>
-            <w:shd w:fill="F1F4F9" w:color="auto" w:val="clear"/>
+              <w:t xml:space="preserve">Protected file holding the salted PBKDF2-SHA256 hash of the emergency secret. Must be writable/persisted; never committed and never in the database.</w:t>
+            </w:r>
+          </w:p>
+        </w:tc>
+      </w:tr>
+      <w:tr>
+        <w:tc>
+          <w:tcPr>
+            <w:tcW w:type="dxa" w:w="3300"/>
+            <w:shd w:fill="F1F4F9" w:color="auto" w:val="clear"/>
+            <w:tcMar>
+              <w:top w:type="dxa" w:w="40"/>
+              <w:left w:type="dxa" w:w="70"/>
+              <w:bottom w:type="dxa" w:w="40"/>
+              <w:right w:type="dxa" w:w="70"/>
+            </w:tcMar>
+          </w:tcPr>
+          <w:p>
+            <w:pPr>
+              <w:spacing w:after="0" w:line="240"/>
+            </w:pPr>
+            <w:r>
+              <w:rPr>
+                <w:rFonts w:ascii="Calibri" w:cs="Calibri" w:eastAsia="Calibri" w:hAnsi="Calibri"/>
+                <w:b w:val="false"/>
+                <w:bCs w:val="false"/>
+                <w:color w:val="22303F"/>
+                <w:sz w:val="18"/>
+                <w:szCs w:val="18"/>
+              </w:rPr>
+              <w:t xml:space="preserve">BreakGlass:Iterations</w:t>
+            </w:r>
+          </w:p>
+        </w:tc>
+        <w:tc>
+          <w:tcPr>
+            <w:tcW w:type="dxa" w:w="1500"/>
+            <w:shd w:fill="F1F4F9" w:color="auto" w:val="clear"/>
+            <w:tcMar>
+              <w:top w:type="dxa" w:w="40"/>
+              <w:left w:type="dxa" w:w="70"/>
+              <w:bottom w:type="dxa" w:w="40"/>
+              <w:right w:type="dxa" w:w="70"/>
+            </w:tcMar>
+          </w:tcPr>
+          <w:p>
+            <w:pPr>
+              <w:spacing w:after="0" w:line="240"/>
+            </w:pPr>
+            <w:r>
+              <w:rPr>
+                <w:rFonts w:ascii="Calibri" w:cs="Calibri" w:eastAsia="Calibri" w:hAnsi="Calibri"/>
+                <w:b w:val="false"/>
+                <w:bCs w:val="false"/>
+                <w:color w:val="22303F"/>
+                <w:sz w:val="18"/>
+                <w:szCs w:val="18"/>
+              </w:rPr>
+              <w:t xml:space="preserve">210000</w:t>
+            </w:r>
+          </w:p>
+        </w:tc>
+        <w:tc>
+          <w:tcPr>
+            <w:tcW w:type="dxa" w:w="4700"/>
+            <w:shd w:fill="F1F4F9" w:color="auto" w:val="clear"/>
+            <w:tcMar>
+              <w:top w:type="dxa" w:w="40"/>
+              <w:left w:type="dxa" w:w="70"/>
+              <w:bottom w:type="dxa" w:w="40"/>
+              <w:right w:type="dxa" w:w="70"/>
+            </w:tcMar>
+          </w:tcPr>
+          <w:p>
+            <w:pPr>
+              <w:spacing w:after="0" w:line="240"/>
+            </w:pPr>
+            <w:r>
+              <w:rPr>
+                <w:rFonts w:ascii="Calibri" w:cs="Calibri" w:eastAsia="Calibri" w:hAnsi="Calibri"/>
+                <w:b w:val="false"/>
+                <w:bCs w:val="false"/>
+                <w:color w:val="22303F"/>
+                <w:sz w:val="18"/>
+                <w:szCs w:val="18"/>
+              </w:rPr>
+              <w:t xml:space="preserve">PBKDF2-SHA256 iteration count used to hash the emergency secret.</w:t>
+            </w:r>
+          </w:p>
+        </w:tc>
+      </w:tr>
+      <w:tr>
+        <w:tc>
+          <w:tcPr>
+            <w:tcW w:type="dxa" w:w="3300"/>
+            <w:tcMar>
+              <w:top w:type="dxa" w:w="40"/>
+              <w:left w:type="dxa" w:w="70"/>
+              <w:bottom w:type="dxa" w:w="40"/>
+              <w:right w:type="dxa" w:w="70"/>
+            </w:tcMar>
+          </w:tcPr>
+          <w:p>
+            <w:pPr>
+              <w:spacing w:after="0" w:line="240"/>
+            </w:pPr>
+            <w:r>
+              <w:rPr>
+                <w:rFonts w:ascii="Calibri" w:cs="Calibri" w:eastAsia="Calibri" w:hAnsi="Calibri"/>
+                <w:b w:val="false"/>
+                <w:bCs w:val="false"/>
+                <w:color w:val="22303F"/>
+                <w:sz w:val="18"/>
+                <w:szCs w:val="18"/>
+              </w:rPr>
+              <w:t xml:space="preserve">BreakGlass:MinSecretLength</w:t>
+            </w:r>
+          </w:p>
+        </w:tc>
+        <w:tc>
+          <w:tcPr>
+            <w:tcW w:type="dxa" w:w="1500"/>
+            <w:tcMar>
+              <w:top w:type="dxa" w:w="40"/>
+              <w:left w:type="dxa" w:w="70"/>
+              <w:bottom w:type="dxa" w:w="40"/>
+              <w:right w:type="dxa" w:w="70"/>
+            </w:tcMar>
+          </w:tcPr>
+          <w:p>
+            <w:pPr>
+              <w:spacing w:after="0" w:line="240"/>
+            </w:pPr>
+            <w:r>
+              <w:rPr>
+                <w:rFonts w:ascii="Calibri" w:cs="Calibri" w:eastAsia="Calibri" w:hAnsi="Calibri"/>
+                <w:b w:val="false"/>
+                <w:bCs w:val="false"/>
+                <w:color w:val="22303F"/>
+                <w:sz w:val="18"/>
+                <w:szCs w:val="18"/>
+              </w:rPr>
+              <w:t xml:space="preserve">12</w:t>
+            </w:r>
+          </w:p>
+        </w:tc>
+        <w:tc>
+          <w:tcPr>
+            <w:tcW w:type="dxa" w:w="4700"/>
+            <w:tcMar>
+              <w:top w:type="dxa" w:w="40"/>
+              <w:left w:type="dxa" w:w="70"/>
+              <w:bottom w:type="dxa" w:w="40"/>
+              <w:right w:type="dxa" w:w="70"/>
+            </w:tcMar>
+          </w:tcPr>
+          <w:p>
+            <w:pPr>
+              <w:spacing w:after="0" w:line="240"/>
+            </w:pPr>
+            <w:r>
+              <w:rPr>
+                <w:rFonts w:ascii="Calibri" w:cs="Calibri" w:eastAsia="Calibri" w:hAnsi="Calibri"/>
+                <w:b w:val="false"/>
+                <w:bCs w:val="false"/>
+                <w:color w:val="22303F"/>
+                <w:sz w:val="18"/>
+                <w:szCs w:val="18"/>
+              </w:rPr>
+              <w:t xml:space="preserve">Minimum length enforced when an administrator sets the emergency secret.</w:t>
+            </w:r>
+          </w:p>
+        </w:tc>
+      </w:tr>
+      <w:tr>
+        <w:tc>
+          <w:tcPr>
+            <w:tcW w:type="dxa" w:w="3300"/>
+            <w:shd w:fill="F1F4F9" w:color="auto" w:val="clear"/>
+            <w:tcMar>
+              <w:top w:type="dxa" w:w="40"/>
+              <w:left w:type="dxa" w:w="70"/>
+              <w:bottom w:type="dxa" w:w="40"/>
+              <w:right w:type="dxa" w:w="70"/>
+            </w:tcMar>
+          </w:tcPr>
+          <w:p>
+            <w:pPr>
+              <w:spacing w:after="0" w:line="240"/>
+            </w:pPr>
+            <w:r>
+              <w:rPr>
+                <w:rFonts w:ascii="Calibri" w:cs="Calibri" w:eastAsia="Calibri" w:hAnsi="Calibri"/>
+                <w:b w:val="false"/>
+                <w:bCs w:val="false"/>
+                <w:color w:val="22303F"/>
+                <w:sz w:val="18"/>
+                <w:szCs w:val="18"/>
+              </w:rPr>
+              <w:t xml:space="preserve">BreakGlass:SaltBase64</w:t>
+            </w:r>
+          </w:p>
+        </w:tc>
+        <w:tc>
+          <w:tcPr>
+            <w:tcW w:type="dxa" w:w="1500"/>
+            <w:shd w:fill="F1F4F9" w:color="auto" w:val="clear"/>
+            <w:tcMar>
+              <w:top w:type="dxa" w:w="40"/>
+              <w:left w:type="dxa" w:w="70"/>
+              <w:bottom w:type="dxa" w:w="40"/>
+              <w:right w:type="dxa" w:w="70"/>
+            </w:tcMar>
+          </w:tcPr>
+          <w:p>
+            <w:pPr>
+              <w:spacing w:after="0" w:line="240"/>
+            </w:pPr>
+            <w:r>
+              <w:rPr>
+                <w:rFonts w:ascii="Calibri" w:cs="Calibri" w:eastAsia="Calibri" w:hAnsi="Calibri"/>
+                <w:b w:val="false"/>
+                <w:bCs w:val="false"/>
+                <w:color w:val="22303F"/>
+                <w:sz w:val="18"/>
+                <w:szCs w:val="18"/>
+              </w:rPr>
+              <w:t xml:space="preserve">(optional)</w:t>
+            </w:r>
+          </w:p>
+        </w:tc>
+        <w:tc>
+          <w:tcPr>
+            <w:tcW w:type="dxa" w:w="4700"/>
+            <w:shd w:fill="F1F4F9" w:color="auto" w:val="clear"/>
+            <w:tcMar>
+              <w:top w:type="dxa" w:w="40"/>
+              <w:left w:type="dxa" w:w="70"/>
+              <w:bottom w:type="dxa" w:w="40"/>
+              <w:right w:type="dxa" w:w="70"/>
+            </w:tcMar>
+          </w:tcPr>
+          <w:p>
+            <w:pPr>
+              <w:spacing w:after="0" w:line="240"/>
+            </w:pPr>
+            <w:r>
+              <w:rPr>
+                <w:rFonts w:ascii="Calibri" w:cs="Calibri" w:eastAsia="Calibri" w:hAnsi="Calibri"/>
+                <w:b w:val="false"/>
+                <w:bCs w:val="false"/>
+                <w:color w:val="22303F"/>
+                <w:sz w:val="18"/>
+                <w:szCs w:val="18"/>
+              </w:rPr>
+              <w:t xml:space="preserve">Optional base64 salt override; a per-secret salt is generated when omitted.</w:t>
+            </w:r>
+          </w:p>
+        </w:tc>
+      </w:tr>
+      <w:tr>
+        <w:tc>
+          <w:tcPr>
+            <w:tcW w:type="dxa" w:w="3300"/>
             <w:tcMar>
               <w:top w:type="dxa" w:w="40"/>
               <w:left w:type="dxa" w:w="70"/>
@@ -2504,7 +2857,6 @@
         <w:tc>
           <w:tcPr>
             <w:tcW w:type="dxa" w:w="1500"/>
-            <w:shd w:fill="F1F4F9" w:color="auto" w:val="clear"/>
             <w:tcMar>
               <w:top w:type="dxa" w:w="40"/>
               <w:left w:type="dxa" w:w="70"/>
@@ -2532,7 +2884,6 @@
         <w:tc>
           <w:tcPr>
             <w:tcW w:type="dxa" w:w="4700"/>
-            <w:shd w:fill="F1F4F9" w:color="auto" w:val="clear"/>
             <w:tcMar>
               <w:top w:type="dxa" w:w="40"/>
               <w:left w:type="dxa" w:w="70"/>
@@ -2562,6 +2913,7 @@
         <w:tc>
           <w:tcPr>
             <w:tcW w:type="dxa" w:w="3300"/>
+            <w:shd w:fill="F1F4F9" w:color="auto" w:val="clear"/>
             <w:tcMar>
               <w:top w:type="dxa" w:w="40"/>
               <w:left w:type="dxa" w:w="70"/>
@@ -2589,6 +2941,7 @@
         <w:tc>
           <w:tcPr>
             <w:tcW w:type="dxa" w:w="1500"/>
+            <w:shd w:fill="F1F4F9" w:color="auto" w:val="clear"/>
             <w:tcMar>
               <w:top w:type="dxa" w:w="40"/>
               <w:left w:type="dxa" w:w="70"/>
@@ -2616,6 +2969,7 @@
         <w:tc>
           <w:tcPr>
             <w:tcW w:type="dxa" w:w="4700"/>
+            <w:shd w:fill="F1F4F9" w:color="auto" w:val="clear"/>
             <w:tcMar>
               <w:top w:type="dxa" w:w="40"/>
               <w:left w:type="dxa" w:w="70"/>
@@ -4832,7 +5186,7 @@
           <w:sz w:val="30"/>
           <w:szCs w:val="30"/>
         </w:rPr>
-        <w:t xml:space="preserve">7. OCR (Azure Document Intelligence)</w:t>
+        <w:t xml:space="preserve">7. Scheduled Reports</w:t>
       </w:r>
     </w:p>
     <w:tbl>
@@ -4966,6 +5320,401 @@
                 <w:sz w:val="18"/>
                 <w:szCs w:val="18"/>
               </w:rPr>
+              <w:t xml:space="preserve">Reports:SchedulerEnabled</w:t>
+            </w:r>
+          </w:p>
+        </w:tc>
+        <w:tc>
+          <w:tcPr>
+            <w:tcW w:type="dxa" w:w="1500"/>
+            <w:shd w:fill="F1F4F9" w:color="auto" w:val="clear"/>
+            <w:tcMar>
+              <w:top w:type="dxa" w:w="40"/>
+              <w:left w:type="dxa" w:w="70"/>
+              <w:bottom w:type="dxa" w:w="40"/>
+              <w:right w:type="dxa" w:w="70"/>
+            </w:tcMar>
+          </w:tcPr>
+          <w:p>
+            <w:pPr>
+              <w:spacing w:after="0" w:line="240"/>
+            </w:pPr>
+            <w:r>
+              <w:rPr>
+                <w:rFonts w:ascii="Calibri" w:cs="Calibri" w:eastAsia="Calibri" w:hAnsi="Calibri"/>
+                <w:b w:val="false"/>
+                <w:bCs w:val="false"/>
+                <w:color w:val="22303F"/>
+                <w:sz w:val="18"/>
+                <w:szCs w:val="18"/>
+              </w:rPr>
+              <w:t xml:space="preserve">true</w:t>
+            </w:r>
+          </w:p>
+        </w:tc>
+        <w:tc>
+          <w:tcPr>
+            <w:tcW w:type="dxa" w:w="4700"/>
+            <w:shd w:fill="F1F4F9" w:color="auto" w:val="clear"/>
+            <w:tcMar>
+              <w:top w:type="dxa" w:w="40"/>
+              <w:left w:type="dxa" w:w="70"/>
+              <w:bottom w:type="dxa" w:w="40"/>
+              <w:right w:type="dxa" w:w="70"/>
+            </w:tcMar>
+          </w:tcPr>
+          <w:p>
+            <w:pPr>
+              <w:spacing w:after="0" w:line="240"/>
+            </w:pPr>
+            <w:r>
+              <w:rPr>
+                <w:rFonts w:ascii="Calibri" w:cs="Calibri" w:eastAsia="Calibri" w:hAnsi="Calibri"/>
+                <w:b w:val="false"/>
+                <w:bCs w:val="false"/>
+                <w:color w:val="22303F"/>
+                <w:sz w:val="18"/>
+                <w:szCs w:val="18"/>
+              </w:rPr>
+              <w:t xml:space="preserve">Turns the background scheduled-report runner on/off.</w:t>
+            </w:r>
+          </w:p>
+        </w:tc>
+      </w:tr>
+      <w:tr>
+        <w:tc>
+          <w:tcPr>
+            <w:tcW w:type="dxa" w:w="3300"/>
+            <w:tcMar>
+              <w:top w:type="dxa" w:w="40"/>
+              <w:left w:type="dxa" w:w="70"/>
+              <w:bottom w:type="dxa" w:w="40"/>
+              <w:right w:type="dxa" w:w="70"/>
+            </w:tcMar>
+          </w:tcPr>
+          <w:p>
+            <w:pPr>
+              <w:spacing w:after="0" w:line="240"/>
+            </w:pPr>
+            <w:r>
+              <w:rPr>
+                <w:rFonts w:ascii="Calibri" w:cs="Calibri" w:eastAsia="Calibri" w:hAnsi="Calibri"/>
+                <w:b w:val="false"/>
+                <w:bCs w:val="false"/>
+                <w:color w:val="22303F"/>
+                <w:sz w:val="18"/>
+                <w:szCs w:val="18"/>
+              </w:rPr>
+              <w:t xml:space="preserve">Reports:PollSeconds</w:t>
+            </w:r>
+          </w:p>
+        </w:tc>
+        <w:tc>
+          <w:tcPr>
+            <w:tcW w:type="dxa" w:w="1500"/>
+            <w:tcMar>
+              <w:top w:type="dxa" w:w="40"/>
+              <w:left w:type="dxa" w:w="70"/>
+              <w:bottom w:type="dxa" w:w="40"/>
+              <w:right w:type="dxa" w:w="70"/>
+            </w:tcMar>
+          </w:tcPr>
+          <w:p>
+            <w:pPr>
+              <w:spacing w:after="0" w:line="240"/>
+            </w:pPr>
+            <w:r>
+              <w:rPr>
+                <w:rFonts w:ascii="Calibri" w:cs="Calibri" w:eastAsia="Calibri" w:hAnsi="Calibri"/>
+                <w:b w:val="false"/>
+                <w:bCs w:val="false"/>
+                <w:color w:val="22303F"/>
+                <w:sz w:val="18"/>
+                <w:szCs w:val="18"/>
+              </w:rPr>
+              <w:t xml:space="preserve">60</w:t>
+            </w:r>
+          </w:p>
+        </w:tc>
+        <w:tc>
+          <w:tcPr>
+            <w:tcW w:type="dxa" w:w="4700"/>
+            <w:tcMar>
+              <w:top w:type="dxa" w:w="40"/>
+              <w:left w:type="dxa" w:w="70"/>
+              <w:bottom w:type="dxa" w:w="40"/>
+              <w:right w:type="dxa" w:w="70"/>
+            </w:tcMar>
+          </w:tcPr>
+          <w:p>
+            <w:pPr>
+              <w:spacing w:after="0" w:line="240"/>
+            </w:pPr>
+            <w:r>
+              <w:rPr>
+                <w:rFonts w:ascii="Calibri" w:cs="Calibri" w:eastAsia="Calibri" w:hAnsi="Calibri"/>
+                <w:b w:val="false"/>
+                <w:bCs w:val="false"/>
+                <w:color w:val="22303F"/>
+                <w:sz w:val="18"/>
+                <w:szCs w:val="18"/>
+              </w:rPr>
+              <w:t xml:space="preserve">How often (seconds) the runner checks for due schedules. Minimum 15.</w:t>
+            </w:r>
+          </w:p>
+        </w:tc>
+      </w:tr>
+      <w:tr>
+        <w:tc>
+          <w:tcPr>
+            <w:tcW w:type="dxa" w:w="3300"/>
+            <w:shd w:fill="F1F4F9" w:color="auto" w:val="clear"/>
+            <w:tcMar>
+              <w:top w:type="dxa" w:w="40"/>
+              <w:left w:type="dxa" w:w="70"/>
+              <w:bottom w:type="dxa" w:w="40"/>
+              <w:right w:type="dxa" w:w="70"/>
+            </w:tcMar>
+          </w:tcPr>
+          <w:p>
+            <w:pPr>
+              <w:spacing w:after="0" w:line="240"/>
+            </w:pPr>
+            <w:r>
+              <w:rPr>
+                <w:rFonts w:ascii="Calibri" w:cs="Calibri" w:eastAsia="Calibri" w:hAnsi="Calibri"/>
+                <w:b w:val="false"/>
+                <w:bCs w:val="false"/>
+                <w:color w:val="22303F"/>
+                <w:sz w:val="18"/>
+                <w:szCs w:val="18"/>
+              </w:rPr>
+              <w:t xml:space="preserve">Reports:TimeZone</w:t>
+            </w:r>
+          </w:p>
+        </w:tc>
+        <w:tc>
+          <w:tcPr>
+            <w:tcW w:type="dxa" w:w="1500"/>
+            <w:shd w:fill="F1F4F9" w:color="auto" w:val="clear"/>
+            <w:tcMar>
+              <w:top w:type="dxa" w:w="40"/>
+              <w:left w:type="dxa" w:w="70"/>
+              <w:bottom w:type="dxa" w:w="40"/>
+              <w:right w:type="dxa" w:w="70"/>
+            </w:tcMar>
+          </w:tcPr>
+          <w:p>
+            <w:pPr>
+              <w:spacing w:after="0" w:line="240"/>
+            </w:pPr>
+            <w:r>
+              <w:rPr>
+                <w:rFonts w:ascii="Calibri" w:cs="Calibri" w:eastAsia="Calibri" w:hAnsi="Calibri"/>
+                <w:b w:val="false"/>
+                <w:bCs w:val="false"/>
+                <w:color w:val="22303F"/>
+                <w:sz w:val="18"/>
+                <w:szCs w:val="18"/>
+              </w:rPr>
+              <w:t xml:space="preserve">Asia/Dubai</w:t>
+            </w:r>
+          </w:p>
+        </w:tc>
+        <w:tc>
+          <w:tcPr>
+            <w:tcW w:type="dxa" w:w="4700"/>
+            <w:shd w:fill="F1F4F9" w:color="auto" w:val="clear"/>
+            <w:tcMar>
+              <w:top w:type="dxa" w:w="40"/>
+              <w:left w:type="dxa" w:w="70"/>
+              <w:bottom w:type="dxa" w:w="40"/>
+              <w:right w:type="dxa" w:w="70"/>
+            </w:tcMar>
+          </w:tcPr>
+          <w:p>
+            <w:pPr>
+              <w:spacing w:after="0" w:line="240"/>
+            </w:pPr>
+            <w:r>
+              <w:rPr>
+                <w:rFonts w:ascii="Calibri" w:cs="Calibri" w:eastAsia="Calibri" w:hAnsi="Calibri"/>
+                <w:b w:val="false"/>
+                <w:bCs w:val="false"/>
+                <w:color w:val="22303F"/>
+                <w:sz w:val="18"/>
+                <w:szCs w:val="18"/>
+              </w:rPr>
+              <w:t xml:space="preserve">Local time zone administrators enter/see schedule times in (IANA 'Asia/Dubai' or Windows 'Arabian Standard Time'); schedules are stored in UTC.</w:t>
+            </w:r>
+          </w:p>
+        </w:tc>
+      </w:tr>
+    </w:tbl>
+    <w:p>
+      <w:pPr>
+        <w:spacing w:after="120" w:line="276"/>
+      </w:pPr>
+      <w:r>
+        <w:rPr>
+          <w:rFonts w:ascii="Calibri" w:cs="Calibri" w:eastAsia="Calibri" w:hAnsi="Calibri"/>
+          <w:b/>
+          <w:bCs/>
+          <w:color w:val="B7791F"/>
+          <w:sz w:val="18"/>
+          <w:szCs w:val="18"/>
+        </w:rPr>
+        <w:t xml:space="preserve">Report e-mails are sent as PDF/Excel attachments, which require Microsoft Graph or SMTP email; SQL Server Database Mail cannot attach in-memory files.</w:t>
+      </w:r>
+    </w:p>
+    <w:p>
+      <w:pPr>
+        <w:pStyle w:val="Heading1"/>
+        <w:spacing w:after="120" w:before="260"/>
+      </w:pPr>
+      <w:r>
+        <w:rPr>
+          <w:rFonts w:ascii="Calibri" w:cs="Calibri" w:eastAsia="Calibri" w:hAnsi="Calibri"/>
+          <w:b/>
+          <w:bCs/>
+          <w:color w:val="0B2545"/>
+          <w:sz w:val="30"/>
+          <w:szCs w:val="30"/>
+        </w:rPr>
+        <w:t xml:space="preserve">8. OCR (Azure Document Intelligence)</w:t>
+      </w:r>
+    </w:p>
+    <w:tbl>
+      <w:tblPr>
+        <w:tblW w:type="dxa" w:w="9500"/>
+        <w:tblBorders>
+          <w:top w:val="single" w:color="D3DAE6" w:sz="4"/>
+          <w:left w:val="single" w:color="D3DAE6" w:sz="4"/>
+          <w:bottom w:val="single" w:color="D3DAE6" w:sz="4"/>
+          <w:right w:val="single" w:color="D3DAE6" w:sz="4"/>
+          <w:insideH w:val="single" w:color="D3DAE6" w:sz="4"/>
+          <w:insideV w:val="single" w:color="D3DAE6" w:sz="4"/>
+        </w:tblBorders>
+      </w:tblPr>
+      <w:tblGrid>
+        <w:gridCol w:w="3300"/>
+        <w:gridCol w:w="1500"/>
+        <w:gridCol w:w="4700"/>
+      </w:tblGrid>
+      <w:tr>
+        <w:trPr>
+          <w:tblHeader/>
+        </w:trPr>
+        <w:tc>
+          <w:tcPr>
+            <w:tcW w:type="dxa" w:w="3300"/>
+            <w:shd w:fill="0B2545" w:color="auto" w:val="clear"/>
+            <w:tcMar>
+              <w:top w:type="dxa" w:w="40"/>
+              <w:left w:type="dxa" w:w="70"/>
+              <w:bottom w:type="dxa" w:w="40"/>
+              <w:right w:type="dxa" w:w="70"/>
+            </w:tcMar>
+          </w:tcPr>
+          <w:p>
+            <w:pPr>
+              <w:spacing w:after="0" w:line="240"/>
+            </w:pPr>
+            <w:r>
+              <w:rPr>
+                <w:rFonts w:ascii="Calibri" w:cs="Calibri" w:eastAsia="Calibri" w:hAnsi="Calibri"/>
+                <w:b/>
+                <w:bCs/>
+                <w:color w:val="FFFFFF"/>
+                <w:sz w:val="18"/>
+                <w:szCs w:val="18"/>
+              </w:rPr>
+              <w:t xml:space="preserve">Setting</w:t>
+            </w:r>
+          </w:p>
+        </w:tc>
+        <w:tc>
+          <w:tcPr>
+            <w:tcW w:type="dxa" w:w="1500"/>
+            <w:shd w:fill="0B2545" w:color="auto" w:val="clear"/>
+            <w:tcMar>
+              <w:top w:type="dxa" w:w="40"/>
+              <w:left w:type="dxa" w:w="70"/>
+              <w:bottom w:type="dxa" w:w="40"/>
+              <w:right w:type="dxa" w:w="70"/>
+            </w:tcMar>
+          </w:tcPr>
+          <w:p>
+            <w:pPr>
+              <w:spacing w:after="0" w:line="240"/>
+            </w:pPr>
+            <w:r>
+              <w:rPr>
+                <w:rFonts w:ascii="Calibri" w:cs="Calibri" w:eastAsia="Calibri" w:hAnsi="Calibri"/>
+                <w:b/>
+                <w:bCs/>
+                <w:color w:val="FFFFFF"/>
+                <w:sz w:val="18"/>
+                <w:szCs w:val="18"/>
+              </w:rPr>
+              <w:t xml:space="preserve">Value / example</w:t>
+            </w:r>
+          </w:p>
+        </w:tc>
+        <w:tc>
+          <w:tcPr>
+            <w:tcW w:type="dxa" w:w="4700"/>
+            <w:shd w:fill="0B2545" w:color="auto" w:val="clear"/>
+            <w:tcMar>
+              <w:top w:type="dxa" w:w="40"/>
+              <w:left w:type="dxa" w:w="70"/>
+              <w:bottom w:type="dxa" w:w="40"/>
+              <w:right w:type="dxa" w:w="70"/>
+            </w:tcMar>
+          </w:tcPr>
+          <w:p>
+            <w:pPr>
+              <w:spacing w:after="0" w:line="240"/>
+            </w:pPr>
+            <w:r>
+              <w:rPr>
+                <w:rFonts w:ascii="Calibri" w:cs="Calibri" w:eastAsia="Calibri" w:hAnsi="Calibri"/>
+                <w:b/>
+                <w:bCs/>
+                <w:color w:val="FFFFFF"/>
+                <w:sz w:val="18"/>
+                <w:szCs w:val="18"/>
+              </w:rPr>
+              <w:t xml:space="preserve">Description</w:t>
+            </w:r>
+          </w:p>
+        </w:tc>
+      </w:tr>
+      <w:tr>
+        <w:tc>
+          <w:tcPr>
+            <w:tcW w:type="dxa" w:w="3300"/>
+            <w:shd w:fill="F1F4F9" w:color="auto" w:val="clear"/>
+            <w:tcMar>
+              <w:top w:type="dxa" w:w="40"/>
+              <w:left w:type="dxa" w:w="70"/>
+              <w:bottom w:type="dxa" w:w="40"/>
+              <w:right w:type="dxa" w:w="70"/>
+            </w:tcMar>
+          </w:tcPr>
+          <w:p>
+            <w:pPr>
+              <w:spacing w:after="0" w:line="240"/>
+            </w:pPr>
+            <w:r>
+              <w:rPr>
+                <w:rFonts w:ascii="Calibri" w:cs="Calibri" w:eastAsia="Calibri" w:hAnsi="Calibri"/>
+                <w:b w:val="false"/>
+                <w:bCs w:val="false"/>
+                <w:color w:val="22303F"/>
+                <w:sz w:val="18"/>
+                <w:szCs w:val="18"/>
+              </w:rPr>
               <w:t xml:space="preserve">Ocr:Provider</w:t>
             </w:r>
           </w:p>
@@ -5380,7 +6129,7 @@
           <w:sz w:val="30"/>
           <w:szCs w:val="30"/>
         </w:rPr>
-        <w:t xml:space="preserve">8. Self-Service OAuth API (hosted in SupplierPortal.Web)</w:t>
+        <w:t xml:space="preserve">9. Self-Service OAuth API (hosted in SupplierPortal.Web)</w:t>
       </w:r>
     </w:p>
     <w:p>
@@ -5941,7 +6690,7 @@
           <w:sz w:val="30"/>
           <w:szCs w:val="30"/>
         </w:rPr>
-        <w:t xml:space="preserve">9. General</w:t>
+        <w:t xml:space="preserve">10. General</w:t>
       </w:r>
     </w:p>
     <w:tbl>
@@ -6419,7 +7168,7 @@
           <w:sz w:val="30"/>
           <w:szCs w:val="30"/>
         </w:rPr>
-        <w:t xml:space="preserve">10. Environment Provisioning Steps</w:t>
+        <w:t xml:space="preserve">11. Environment Provisioning Steps</w:t>
       </w:r>
     </w:p>
     <w:p>

</xml_diff>